<commit_message>
Versão 4.0: imóvel a R$ 1,4 mi, três casas e ressalva fiscal
- Imóvel mobiliado volta a R$ 1.400.000,00; montante bruto passa a
  R$ 1.876.046,901.
- Divisor passa a 74,625%, exato em três casas. Percentuais e valores de
  retirada expressos com três casas decimais, arredondados ao centavo no
  pagamento. As participações de 37,3125% e 12,4375% mantêm a quarta casa
  por serem metades exatas de 74,625% e 24,875%.
- Novo item 2.6: dívidas fiscais parceladas e adimplentes perante Receita
  Federal, Receita Estadual, Receita Municipal e TCU não precisam ser
  quitadas à vista nem impedem a Meta I. A perda da adimplência
  restabelece a trava.
- Novo item 4.5: os 0,500% de Leonardo são participação anterior à
  reorganização societária, não decorrem de herança e não integram o
  custeio do imóvel.

Co-Authored-By: Claude Opus 5 <noreply@anthropic.com>
Claude-Session: https://claude.ai/code/session_017S3Nxpn86HbRVN26NB9rcj
</commit_message>
<xml_diff>
--- a/docs/Anexo-I-Destinacao-de-Resultados.docx
+++ b/docs/Anexo-I-Destinacao-de-Resultados.docx
@@ -38,7 +38,7 @@
     </w:p>
     <w:p>
       <w:pPr>
-        <w:spacing w:after="150" w:line="264" w:lineRule="auto"/>
+        <w:spacing w:after="150" w:line="252" w:lineRule="auto"/>
         <w:jc w:val="both"/>
       </w:pPr>
       <w:r>
@@ -57,7 +57,7 @@
     </w:p>
     <w:p>
       <w:pPr>
-        <w:spacing w:after="130" w:before="0" w:line="264" w:lineRule="auto"/>
+        <w:spacing w:after="130" w:before="0" w:line="252" w:lineRule="auto"/>
         <w:jc w:val="both"/>
       </w:pPr>
       <w:r>
@@ -72,7 +72,7 @@
     </w:p>
     <w:p>
       <w:pPr>
-        <w:spacing w:after="130" w:before="0" w:line="264" w:lineRule="auto"/>
+        <w:spacing w:after="130" w:before="0" w:line="252" w:lineRule="auto"/>
         <w:jc w:val="both"/>
       </w:pPr>
       <w:r>
@@ -82,12 +82,12 @@
           <w:sz w:val="21"/>
           <w:szCs w:val="21"/>
         </w:rPr>
-        <w:t xml:space="preserve">Quanto ao imóvel da usufrutuária: o custo deve recair apenas sobre Leonardo e Bárbara, filhos biológicos e herdeiros dela. Como o dinheiro sai da Companhia, que pertence aos quatro, distribui-se um montante bruto calibrado para que a fatia dos dois cubra exatamente o imóvel e os demais recebam em dinheiro o equivalente à sua participação. Daí a divisão por 74,62%, soma das participações de Leonardo e Bárbara — adotada com duas casas, e não pela fração exata de 74,625%, para que o número do contrato seja o da planilha.</w:t>
-      </w:r>
-    </w:p>
-    <w:p>
-      <w:pPr>
-        <w:spacing w:after="300" w:before="0" w:line="264" w:lineRule="auto"/>
+        <w:t xml:space="preserve">Quanto ao imóvel da usufrutuária: o custo deve recair apenas sobre Leonardo e Bárbara, filhos biológicos e herdeiros dela. Como o dinheiro sai da Companhia, que pertence aos quatro, distribui-se um montante bruto calibrado para que a fatia dos dois cubra exatamente o imóvel e os demais recebam em dinheiro o equivalente à sua participação. Daí a divisão por 74,625%, soma das participações de Leonardo e Bárbara. Os percentuais de 37,3125% e 12,4375% carregam a quarta casa por serem metades exatas de 74,625% e de 24,875%; arredondá-los à terceira faria a soma fechar em 100,002% e os valores deixariam de bater com o bruto.</w:t>
+      </w:r>
+    </w:p>
+    <w:p>
+      <w:pPr>
+        <w:spacing w:after="300" w:before="0" w:line="252" w:lineRule="auto"/>
         <w:jc w:val="both"/>
       </w:pPr>
       <w:r>
@@ -103,7 +103,7 @@
     <w:p>
       <w:pPr>
         <w:keepNext/>
-        <w:spacing w:after="130" w:before="225" w:line="264" w:lineRule="auto"/>
+        <w:spacing w:after="118" w:before="205" w:line="252" w:lineRule="auto"/>
       </w:pPr>
       <w:r>
         <w:rPr>
@@ -119,7 +119,7 @@
     </w:p>
     <w:p>
       <w:pPr>
-        <w:spacing w:after="130" w:before="0" w:line="264" w:lineRule="auto"/>
+        <w:spacing w:after="118" w:before="0" w:line="252" w:lineRule="auto"/>
         <w:jc w:val="both"/>
       </w:pPr>
       <w:r>
@@ -145,7 +145,7 @@
     </w:p>
     <w:p>
       <w:pPr>
-        <w:spacing w:after="130" w:before="0" w:line="264" w:lineRule="auto"/>
+        <w:spacing w:after="118" w:before="0" w:line="252" w:lineRule="auto"/>
         <w:jc w:val="both"/>
       </w:pPr>
       <w:r>
@@ -172,7 +172,7 @@
     <w:p>
       <w:pPr>
         <w:keepNext/>
-        <w:spacing w:after="130" w:before="225" w:line="264" w:lineRule="auto"/>
+        <w:spacing w:after="118" w:before="205" w:line="252" w:lineRule="auto"/>
       </w:pPr>
       <w:r>
         <w:rPr>
@@ -188,7 +188,7 @@
     </w:p>
     <w:p>
       <w:pPr>
-        <w:spacing w:after="130" w:before="0" w:line="264" w:lineRule="auto"/>
+        <w:spacing w:after="118" w:before="0" w:line="252" w:lineRule="auto"/>
         <w:jc w:val="both"/>
       </w:pPr>
       <w:r>
@@ -209,7 +209,7 @@
           <w:sz w:val="22"/>
           <w:szCs w:val="22"/>
         </w:rPr>
-        <w:t xml:space="preserve">Integram o Perímetro as obrigações pecuniárias, vencidas ou vincendas, originadas nos negócios conduzidos, liderados ou orientados por Wilson Grison, </w:t>
+        <w:t xml:space="preserve">Integram o Perímetro as obrigações pecuniárias, vencidas ou vincendas, originadas nos negócios conduzidos ou liderados por Wilson Grison, </w:t>
       </w:r>
       <w:r>
         <w:rPr>
@@ -229,12 +229,12 @@
           <w:sz w:val="22"/>
           <w:szCs w:val="22"/>
         </w:rPr>
-        <w:t xml:space="preserve">: financiamentos e empréstimos bancários, dívidas com fornecedores e prestadores de serviço, tributos de qualquer esfera, multas e autos de infração, custas e emolumentos cartorários, parcelamentos e transações, e obrigações decorrentes de garantias prestadas.</w:t>
-      </w:r>
-    </w:p>
-    <w:p>
-      <w:pPr>
-        <w:spacing w:after="130" w:before="0" w:line="264" w:lineRule="auto"/>
+        <w:t xml:space="preserve">: financiamentos e empréstimos bancários, dívidas com fornecedores e prestadores de serviço, tributos de qualquer esfera, multas e autos de infração, custas e emolumentos cartorários, parcelamentos e obrigações decorrentes de garantias prestadas.</w:t>
+      </w:r>
+    </w:p>
+    <w:p>
+      <w:pPr>
+        <w:spacing w:after="118" w:before="0" w:line="252" w:lineRule="auto"/>
         <w:jc w:val="both"/>
       </w:pPr>
       <w:r>
@@ -255,12 +255,12 @@
           <w:sz w:val="22"/>
           <w:szCs w:val="22"/>
         </w:rPr>
-        <w:t xml:space="preserve">Alcança as dívidas da Grison e Cia Ltda., as pessoais de Wilson Grison e de Elman M. Coelho Grison como devedores, avalistas, fiadores ou coobrigados, e as das sociedades por eles constituídas, controladas ou dirigidas de fato, ainda que em nome de filhos, cônjuge ou terceiros, incluindo EMC Grison, Bioaçaí, ML Serviços Agrícolas, Natyrê, Tiúba 2 SPE e Patrimônio Digital. Obrigação não relacionada no Anexo II que se enquadre nesta definição integra o Perímetro.</w:t>
-      </w:r>
-    </w:p>
-    <w:p>
-      <w:pPr>
-        <w:spacing w:after="130" w:before="0" w:line="264" w:lineRule="auto"/>
+        <w:t xml:space="preserve">Alcança as dívidas da Grison e Cia Ltda., as pessoais de Wilson e de Elman M. Coelho Grison como devedores, avalistas, fiadores ou coobrigados, e as das sociedades por eles constituídas, controladas ou dirigidas de fato, ainda que em nome de filhos, cônjuge ou terceiros — EMC Grison, Bioaçaí, ML Serviços Agrícolas, Natyrê, Tiúba 2 SPE e Patrimônio Digital. Obrigação não relacionada no Anexo II que se enquadre nesta definição integra o Perímetro.</w:t>
+      </w:r>
+    </w:p>
+    <w:p>
+      <w:pPr>
+        <w:spacing w:after="118" w:before="0" w:line="252" w:lineRule="auto"/>
         <w:jc w:val="both"/>
       </w:pPr>
       <w:r>
@@ -286,7 +286,7 @@
     </w:p>
     <w:p>
       <w:pPr>
-        <w:spacing w:after="130" w:before="0" w:line="264" w:lineRule="auto"/>
+        <w:spacing w:after="118" w:before="0" w:line="252" w:lineRule="auto"/>
         <w:jc w:val="both"/>
       </w:pPr>
       <w:r>
@@ -307,12 +307,12 @@
           <w:sz w:val="22"/>
           <w:szCs w:val="22"/>
         </w:rPr>
-        <w:t xml:space="preserve">Não integra o Perímetro o adiantamento recebido do loteador parceiro (Santa Helena), recomposto por retenção, pelo próprio loteador, dos repasses devidos ao grupo. Sua liquidação é automática e independe de desembolso ou de ato de gestão dos sócios.</w:t>
-      </w:r>
-    </w:p>
-    <w:p>
-      <w:pPr>
-        <w:spacing w:after="130" w:before="0" w:line="264" w:lineRule="auto"/>
+        <w:t xml:space="preserve">Não integra o Perímetro o adiantamento do loteador parceiro (Santa Helena), recomposto por retenção, pelo próprio loteador, dos repasses devidos ao grupo: sua liquidação é automática e independe de ato de gestão dos sócios.</w:t>
+      </w:r>
+    </w:p>
+    <w:p>
+      <w:pPr>
+        <w:spacing w:after="118" w:before="0" w:line="252" w:lineRule="auto"/>
         <w:jc w:val="both"/>
       </w:pPr>
       <w:r>
@@ -344,13 +344,50 @@
           <w:sz w:val="22"/>
           <w:szCs w:val="22"/>
         </w:rPr>
-        <w:t xml:space="preserve">Parcelamento em curso, ainda que adimplente, não é Dívida Quitada.</w:t>
+        <w:t xml:space="preserve">Parcelamento em curso não é Dívida Quitada, ressalvado o item 2.6.</w:t>
+      </w:r>
+    </w:p>
+    <w:p>
+      <w:pPr>
+        <w:spacing w:after="118" w:before="0" w:line="252" w:lineRule="auto"/>
+        <w:jc w:val="both"/>
+      </w:pPr>
+      <w:r>
+        <w:rPr>
+          <w:rFonts w:ascii="Times New Roman" w:cs="Times New Roman" w:eastAsia="Times New Roman" w:hAnsi="Times New Roman"/>
+          <w:b/>
+          <w:bCs/>
+          <w:color w:val="000000"/>
+          <w:sz w:val="22"/>
+          <w:szCs w:val="22"/>
+        </w:rPr>
+        <w:t xml:space="preserve">2.6.  </w:t>
+      </w:r>
+      <w:r>
+        <w:rPr>
+          <w:rFonts w:ascii="Times New Roman" w:cs="Times New Roman" w:eastAsia="Times New Roman" w:hAnsi="Times New Roman"/>
+          <w:b/>
+          <w:bCs/>
+          <w:color w:val="000000"/>
+          <w:sz w:val="22"/>
+          <w:szCs w:val="22"/>
+        </w:rPr>
+        <w:t xml:space="preserve">Dívidas Fiscais Parceladas. </w:t>
+      </w:r>
+      <w:r>
+        <w:rPr>
+          <w:rFonts w:ascii="Times New Roman" w:cs="Times New Roman" w:eastAsia="Times New Roman" w:hAnsi="Times New Roman"/>
+          <w:color w:val="000000"/>
+          <w:sz w:val="22"/>
+          <w:szCs w:val="22"/>
+        </w:rPr>
+        <w:t xml:space="preserve">Não precisam ser quitadas à vista, nem impedem o cumprimento da Meta I, as obrigações perante a Receita Federal, inclusive imposto de renda, a Receita Estadual, a Receita Municipal e o Tribunal de Contas da União submetidas a parcelamento ou transação regularmente deferidos, adimplentes e sem garantia pessoal de Sócio Sujeito à Retenção. A perda da adimplência restabelece a trava do item 5 até a regularização.</w:t>
       </w:r>
     </w:p>
     <w:p>
       <w:pPr>
         <w:keepNext/>
-        <w:spacing w:after="130" w:before="225" w:line="264" w:lineRule="auto"/>
+        <w:spacing w:after="118" w:before="205" w:line="252" w:lineRule="auto"/>
       </w:pPr>
       <w:r>
         <w:rPr>
@@ -366,7 +403,7 @@
     </w:p>
     <w:p>
       <w:pPr>
-        <w:spacing w:after="110" w:before="0" w:line="264" w:lineRule="auto"/>
+        <w:spacing w:after="110" w:before="0" w:line="252" w:lineRule="auto"/>
         <w:jc w:val="both"/>
       </w:pPr>
       <w:r>
@@ -392,7 +429,7 @@
     </w:p>
     <w:p>
       <w:pPr>
-        <w:spacing w:after="90" w:before="0" w:line="264" w:lineRule="auto"/>
+        <w:spacing w:after="90" w:before="0" w:line="252" w:lineRule="auto"/>
         <w:ind w:left="420"/>
         <w:jc w:val="both"/>
       </w:pPr>
@@ -430,7 +467,7 @@
     </w:p>
     <w:p>
       <w:pPr>
-        <w:spacing w:after="90" w:before="0" w:line="264" w:lineRule="auto"/>
+        <w:spacing w:after="90" w:before="0" w:line="252" w:lineRule="auto"/>
         <w:ind w:left="420"/>
         <w:jc w:val="both"/>
       </w:pPr>
@@ -468,7 +505,7 @@
     </w:p>
     <w:p>
       <w:pPr>
-        <w:spacing w:after="130" w:before="0" w:line="264" w:lineRule="auto"/>
+        <w:spacing w:after="118" w:before="0" w:line="252" w:lineRule="auto"/>
         <w:ind w:left="420"/>
         <w:jc w:val="both"/>
       </w:pPr>
@@ -501,12 +538,12 @@
           <w:sz w:val="22"/>
           <w:szCs w:val="22"/>
         </w:rPr>
-        <w:t xml:space="preserve">Disponibilidade, em reserva vinculada, do montante bruto apurado na forma do item 4.3, correspondente a R$ 2.144.197,27 (dois milhões, cento e quarenta e quatro mil, cento e noventa e sete reais e vinte e sete centavos) para imóvel mobiliado de R$ 1.600.000,00 — ou operação já concluída.</w:t>
-      </w:r>
-    </w:p>
-    <w:p>
-      <w:pPr>
-        <w:spacing w:after="130" w:before="0" w:line="264" w:lineRule="auto"/>
+        <w:t xml:space="preserve">Disponibilidade, em reserva vinculada, do montante bruto apurado na forma do item 4.3, correspondente a R$ 1.876.046,901 para imóvel mobiliado de R$ 1.400.000,00 — ou operação já concluída.</w:t>
+      </w:r>
+    </w:p>
+    <w:p>
+      <w:pPr>
+        <w:spacing w:after="118" w:before="0" w:line="252" w:lineRule="auto"/>
         <w:jc w:val="both"/>
       </w:pPr>
       <w:r>
@@ -527,12 +564,12 @@
           <w:sz w:val="22"/>
           <w:szCs w:val="22"/>
         </w:rPr>
-        <w:t xml:space="preserve">A Meta I somente se tem por cumprida mediante, cumulativamente: certidões negativas, ou positivas com efeito de negativas, federais, estaduais e municipais da Grison e Cia Ltda. e das demais pessoas do Perímetro; ausência de protesto; ausência de anotação restritiva em Serasa, SPC ou equivalente; e baixa dos gravames. Anotação decorrente de dívida particular de sócio não impede o cumprimento da Meta.</w:t>
-      </w:r>
-    </w:p>
-    <w:p>
-      <w:pPr>
-        <w:spacing w:after="130" w:before="0" w:line="264" w:lineRule="auto"/>
+        <w:t xml:space="preserve">A Meta I somente se tem por cumprida mediante, cumulativamente: certidões negativas, ou positivas com efeito de negativas, federais, estaduais e municipais das pessoas do Perímetro; ausência de protesto; ausência de anotação restritiva em Serasa, SPC ou equivalente; e baixa dos gravames. Anotação decorrente de dívida particular de sócio não impede o cumprimento da Meta.</w:t>
+      </w:r>
+    </w:p>
+    <w:p>
+      <w:pPr>
+        <w:spacing w:after="118" w:before="0" w:line="252" w:lineRule="auto"/>
         <w:jc w:val="both"/>
       </w:pPr>
       <w:r>
@@ -559,7 +596,7 @@
     <w:p>
       <w:pPr>
         <w:keepNext/>
-        <w:spacing w:after="130" w:before="225" w:line="264" w:lineRule="auto"/>
+        <w:spacing w:after="118" w:before="205" w:line="252" w:lineRule="auto"/>
       </w:pPr>
       <w:r>
         <w:rPr>
@@ -575,7 +612,7 @@
     </w:p>
     <w:p>
       <w:pPr>
-        <w:spacing w:after="130" w:before="0" w:line="264" w:lineRule="auto"/>
+        <w:spacing w:after="118" w:before="0" w:line="252" w:lineRule="auto"/>
         <w:jc w:val="both"/>
       </w:pPr>
       <w:r>
@@ -601,7 +638,7 @@
     </w:p>
     <w:p>
       <w:pPr>
-        <w:spacing w:after="130" w:before="0" w:line="264" w:lineRule="auto"/>
+        <w:spacing w:after="118" w:before="0" w:line="252" w:lineRule="auto"/>
         <w:jc w:val="both"/>
       </w:pPr>
       <w:r>
@@ -622,12 +659,12 @@
           <w:sz w:val="22"/>
           <w:szCs w:val="22"/>
         </w:rPr>
-        <w:t xml:space="preserve">O custo econômico da aquisição recai exclusivamente sobre Leonardo Grison e Bárbara Grison, filhos biológicos e herdeiros da usufrutuária. Wellington Grison e Marcelo Grison não concorrem para esse custeio e recebem em dinheiro o correspondente à sua participação no montante bruto.</w:t>
-      </w:r>
-    </w:p>
-    <w:p>
-      <w:pPr>
-        <w:spacing w:after="130" w:before="0" w:line="264" w:lineRule="auto"/>
+        <w:t xml:space="preserve">O custo econômico da aquisição recai exclusivamente sobre Leonardo e Bárbara Grison, filhos biológicos e herdeiros da usufrutuária. Wellington e Marcelo Grison não concorrem para esse custeio e recebem em dinheiro o correspondente à sua participação no montante bruto.</w:t>
+      </w:r>
+    </w:p>
+    <w:p>
+      <w:pPr>
+        <w:spacing w:after="118" w:before="0" w:line="252" w:lineRule="auto"/>
         <w:jc w:val="both"/>
       </w:pPr>
       <w:r>
@@ -659,12 +696,12 @@
           <w:sz w:val="22"/>
           <w:szCs w:val="22"/>
         </w:rPr>
-        <w:t xml:space="preserve">O montante bruto da operação corresponde ao valor do imóvel mobiliado dividido por 74,62%, percentual que corresponde à soma das participações de Leonardo (37,31%) e Bárbara (37,31%).</w:t>
-      </w:r>
-    </w:p>
-    <w:p>
-      <w:pPr>
-        <w:spacing w:after="170" w:line="264" w:lineRule="auto"/>
+        <w:t xml:space="preserve">O montante bruto da operação corresponde ao valor do imóvel mobiliado dividido por 74,625%, soma das participações de Leonardo (37,3125%) e Bárbara (37,3125%) na qualidade de herdeiros da usufrutuária.</w:t>
+      </w:r>
+    </w:p>
+    <w:p>
+      <w:pPr>
+        <w:spacing w:after="170" w:line="252" w:lineRule="auto"/>
         <w:jc w:val="center"/>
       </w:pPr>
       <w:r>
@@ -676,12 +713,12 @@
           <w:sz w:val="22"/>
           <w:szCs w:val="22"/>
         </w:rPr>
-        <w:t xml:space="preserve">Montante Bruto  =  Valor do Imóvel Mobiliado  ÷  74,62%</w:t>
-      </w:r>
-    </w:p>
-    <w:p>
-      <w:pPr>
-        <w:spacing w:after="110" w:before="0" w:line="264" w:lineRule="auto"/>
+        <w:t xml:space="preserve">Montante Bruto  =  Valor do Imóvel Mobiliado  ÷  74,625%</w:t>
+      </w:r>
+    </w:p>
+    <w:p>
+      <w:pPr>
+        <w:spacing w:after="110" w:before="0" w:line="252" w:lineRule="auto"/>
         <w:jc w:val="both"/>
       </w:pPr>
       <w:r>
@@ -707,7 +744,7 @@
     </w:p>
     <w:p>
       <w:pPr>
-        <w:spacing w:after="90" w:before="0" w:line="264" w:lineRule="auto"/>
+        <w:spacing w:after="90" w:before="0" w:line="252" w:lineRule="auto"/>
         <w:ind w:left="420"/>
         <w:jc w:val="both"/>
       </w:pPr>
@@ -725,16 +762,27 @@
       <w:r>
         <w:rPr>
           <w:rFonts w:ascii="Times New Roman" w:cs="Times New Roman" w:eastAsia="Times New Roman" w:hAnsi="Times New Roman"/>
-          <w:color w:val="000000"/>
-          <w:sz w:val="22"/>
-          <w:szCs w:val="22"/>
-        </w:rPr>
-        <w:t xml:space="preserve">37,31% a Bárbara Grison e 37,31% a Leonardo Grison, satisfeitos em bem, pela aquisição do imóvel;</w:t>
-      </w:r>
-    </w:p>
-    <w:p>
-      <w:pPr>
-        <w:spacing w:after="90" w:before="0" w:line="264" w:lineRule="auto"/>
+          <w:b/>
+          <w:bCs/>
+          <w:color w:val="000000"/>
+          <w:sz w:val="22"/>
+          <w:szCs w:val="22"/>
+        </w:rPr>
+        <w:t xml:space="preserve">parcela satisfeita em bem</w:t>
+      </w:r>
+      <w:r>
+        <w:rPr>
+          <w:rFonts w:ascii="Times New Roman" w:cs="Times New Roman" w:eastAsia="Times New Roman" w:hAnsi="Times New Roman"/>
+          <w:color w:val="000000"/>
+          <w:sz w:val="22"/>
+          <w:szCs w:val="22"/>
+        </w:rPr>
+        <w:t xml:space="preserve"> — 37,3125% a Bárbara Grison e 37,3125% a Leonardo Grison, integralmente aplicados na aquisição do imóvel;</w:t>
+      </w:r>
+    </w:p>
+    <w:p>
+      <w:pPr>
+        <w:spacing w:after="90" w:before="0" w:line="252" w:lineRule="auto"/>
         <w:ind w:left="420"/>
         <w:jc w:val="both"/>
       </w:pPr>
@@ -752,16 +800,27 @@
       <w:r>
         <w:rPr>
           <w:rFonts w:ascii="Times New Roman" w:cs="Times New Roman" w:eastAsia="Times New Roman" w:hAnsi="Times New Roman"/>
-          <w:color w:val="000000"/>
-          <w:sz w:val="22"/>
-          <w:szCs w:val="22"/>
-        </w:rPr>
-        <w:t xml:space="preserve">12,44% a Wellington Grison, em dinheiro;</w:t>
-      </w:r>
-    </w:p>
-    <w:p>
-      <w:pPr>
-        <w:spacing w:after="90" w:before="0" w:line="264" w:lineRule="auto"/>
+          <w:b/>
+          <w:bCs/>
+          <w:color w:val="000000"/>
+          <w:sz w:val="22"/>
+          <w:szCs w:val="22"/>
+        </w:rPr>
+        <w:t xml:space="preserve">parcelas em dinheiro</w:t>
+      </w:r>
+      <w:r>
+        <w:rPr>
+          <w:rFonts w:ascii="Times New Roman" w:cs="Times New Roman" w:eastAsia="Times New Roman" w:hAnsi="Times New Roman"/>
+          <w:color w:val="000000"/>
+          <w:sz w:val="22"/>
+          <w:szCs w:val="22"/>
+        </w:rPr>
+        <w:t xml:space="preserve"> — 12,4375% a Wellington Grison e 12,4375% a Marcelo Grison;</w:t>
+      </w:r>
+    </w:p>
+    <w:p>
+      <w:pPr>
+        <w:spacing w:after="118" w:before="0" w:line="252" w:lineRule="auto"/>
         <w:ind w:left="420"/>
         <w:jc w:val="both"/>
       </w:pPr>
@@ -779,43 +838,27 @@
       <w:r>
         <w:rPr>
           <w:rFonts w:ascii="Times New Roman" w:cs="Times New Roman" w:eastAsia="Times New Roman" w:hAnsi="Times New Roman"/>
-          <w:color w:val="000000"/>
-          <w:sz w:val="22"/>
-          <w:szCs w:val="22"/>
-        </w:rPr>
-        <w:t xml:space="preserve">12,44% a Marcelo Grison, em dinheiro;</w:t>
-      </w:r>
-    </w:p>
-    <w:p>
-      <w:pPr>
-        <w:spacing w:after="130" w:before="0" w:line="264" w:lineRule="auto"/>
-        <w:ind w:left="420"/>
-        <w:jc w:val="both"/>
-      </w:pPr>
-      <w:r>
-        <w:rPr>
-          <w:rFonts w:ascii="Times New Roman" w:cs="Times New Roman" w:eastAsia="Times New Roman" w:hAnsi="Times New Roman"/>
-          <w:b/>
-          <w:bCs/>
-          <w:color w:val="000000"/>
-          <w:sz w:val="22"/>
-          <w:szCs w:val="22"/>
-        </w:rPr>
-        <w:t xml:space="preserve">(d)  </w:t>
-      </w:r>
-      <w:r>
-        <w:rPr>
-          <w:rFonts w:ascii="Times New Roman" w:cs="Times New Roman" w:eastAsia="Times New Roman" w:hAnsi="Times New Roman"/>
-          <w:color w:val="000000"/>
-          <w:sz w:val="22"/>
-          <w:szCs w:val="22"/>
-        </w:rPr>
-        <w:t xml:space="preserve">0,5% a Leonardo Grison, em dinheiro, correspondente à sua participação originária na Grison e Cia Ltda.</w:t>
-      </w:r>
-    </w:p>
-    <w:p>
-      <w:pPr>
-        <w:spacing w:after="130" w:before="0" w:line="264" w:lineRule="auto"/>
+          <w:b/>
+          <w:bCs/>
+          <w:color w:val="000000"/>
+          <w:sz w:val="22"/>
+          <w:szCs w:val="22"/>
+        </w:rPr>
+        <w:t xml:space="preserve">parcela em dinheiro</w:t>
+      </w:r>
+      <w:r>
+        <w:rPr>
+          <w:rFonts w:ascii="Times New Roman" w:cs="Times New Roman" w:eastAsia="Times New Roman" w:hAnsi="Times New Roman"/>
+          <w:color w:val="000000"/>
+          <w:sz w:val="22"/>
+          <w:szCs w:val="22"/>
+        </w:rPr>
+        <w:t xml:space="preserve"> — 0,500% a Leonardo Grison.</w:t>
+      </w:r>
+    </w:p>
+    <w:p>
+      <w:pPr>
+        <w:spacing w:after="118" w:before="0" w:line="252" w:lineRule="auto"/>
         <w:jc w:val="both"/>
       </w:pPr>
       <w:r>
@@ -836,24 +879,96 @@
           <w:sz w:val="22"/>
           <w:szCs w:val="22"/>
         </w:rPr>
+        <w:t xml:space="preserve">A participação de 0,500% de Leonardo Grison na Grison e Cia Ltda. é anterior à reorganização societária e não decorre de herança. Seu produto é pago em dinheiro e </w:t>
+      </w:r>
+      <w:r>
+        <w:rPr>
+          <w:rFonts w:ascii="Times New Roman" w:cs="Times New Roman" w:eastAsia="Times New Roman" w:hAnsi="Times New Roman"/>
+          <w:b/>
+          <w:bCs/>
+          <w:color w:val="000000"/>
+          <w:sz w:val="22"/>
+          <w:szCs w:val="22"/>
+        </w:rPr>
+        <w:t xml:space="preserve">não integra o custeio do imóvel</w:t>
+      </w:r>
+      <w:r>
+        <w:rPr>
+          <w:rFonts w:ascii="Times New Roman" w:cs="Times New Roman" w:eastAsia="Times New Roman" w:hAnsi="Times New Roman"/>
+          <w:color w:val="000000"/>
+          <w:sz w:val="22"/>
+          <w:szCs w:val="22"/>
+        </w:rPr>
+        <w:t xml:space="preserve">.</w:t>
+      </w:r>
+    </w:p>
+    <w:p>
+      <w:pPr>
+        <w:spacing w:after="118" w:before="0" w:line="252" w:lineRule="auto"/>
+        <w:jc w:val="both"/>
+      </w:pPr>
+      <w:r>
+        <w:rPr>
+          <w:rFonts w:ascii="Times New Roman" w:cs="Times New Roman" w:eastAsia="Times New Roman" w:hAnsi="Times New Roman"/>
+          <w:b/>
+          <w:bCs/>
+          <w:color w:val="000000"/>
+          <w:sz w:val="22"/>
+          <w:szCs w:val="22"/>
+        </w:rPr>
+        <w:t xml:space="preserve">4.6.  </w:t>
+      </w:r>
+      <w:r>
+        <w:rPr>
+          <w:rFonts w:ascii="Times New Roman" w:cs="Times New Roman" w:eastAsia="Times New Roman" w:hAnsi="Times New Roman"/>
+          <w:color w:val="000000"/>
+          <w:sz w:val="22"/>
+          <w:szCs w:val="22"/>
+        </w:rPr>
+        <w:t xml:space="preserve">Os percentuais e valores deste item são expressos com três casas decimais e arredondados ao centavo no momento do pagamento.</w:t>
+      </w:r>
+    </w:p>
+    <w:p>
+      <w:pPr>
+        <w:spacing w:after="118" w:before="0" w:line="252" w:lineRule="auto"/>
+        <w:jc w:val="both"/>
+      </w:pPr>
+      <w:r>
+        <w:rPr>
+          <w:rFonts w:ascii="Times New Roman" w:cs="Times New Roman" w:eastAsia="Times New Roman" w:hAnsi="Times New Roman"/>
+          <w:b/>
+          <w:bCs/>
+          <w:color w:val="000000"/>
+          <w:sz w:val="22"/>
+          <w:szCs w:val="22"/>
+        </w:rPr>
+        <w:t xml:space="preserve">4.7.  </w:t>
+      </w:r>
+      <w:r>
+        <w:rPr>
+          <w:rFonts w:ascii="Times New Roman" w:cs="Times New Roman" w:eastAsia="Times New Roman" w:hAnsi="Times New Roman"/>
+          <w:color w:val="000000"/>
+          <w:sz w:val="22"/>
+          <w:szCs w:val="22"/>
+        </w:rPr>
         <w:t xml:space="preserve">A aquisição do imóvel e os pagamentos em dinheiro são simultâneos, constituem execução da Meta III e não configuram distribuição vedada pelo item 5.</w:t>
       </w:r>
     </w:p>
     <w:p>
       <w:pPr>
-        <w:spacing w:after="130" w:before="0" w:line="264" w:lineRule="auto"/>
-        <w:jc w:val="both"/>
-      </w:pPr>
-      <w:r>
-        <w:rPr>
-          <w:rFonts w:ascii="Times New Roman" w:cs="Times New Roman" w:eastAsia="Times New Roman" w:hAnsi="Times New Roman"/>
-          <w:b/>
-          <w:bCs/>
-          <w:color w:val="000000"/>
-          <w:sz w:val="22"/>
-          <w:szCs w:val="22"/>
-        </w:rPr>
-        <w:t xml:space="preserve">4.6.  </w:t>
+        <w:spacing w:after="118" w:before="0" w:line="252" w:lineRule="auto"/>
+        <w:jc w:val="both"/>
+      </w:pPr>
+      <w:r>
+        <w:rPr>
+          <w:rFonts w:ascii="Times New Roman" w:cs="Times New Roman" w:eastAsia="Times New Roman" w:hAnsi="Times New Roman"/>
+          <w:b/>
+          <w:bCs/>
+          <w:color w:val="000000"/>
+          <w:sz w:val="22"/>
+          <w:szCs w:val="22"/>
+        </w:rPr>
+        <w:t xml:space="preserve">4.8.  </w:t>
       </w:r>
       <w:r>
         <w:rPr>
@@ -867,54 +982,54 @@
     </w:p>
     <w:p>
       <w:pPr>
-        <w:spacing w:after="130" w:before="0" w:line="264" w:lineRule="auto"/>
-        <w:jc w:val="both"/>
-      </w:pPr>
-      <w:r>
-        <w:rPr>
-          <w:rFonts w:ascii="Times New Roman" w:cs="Times New Roman" w:eastAsia="Times New Roman" w:hAnsi="Times New Roman"/>
-          <w:b/>
-          <w:bCs/>
-          <w:color w:val="000000"/>
-          <w:sz w:val="22"/>
-          <w:szCs w:val="22"/>
-        </w:rPr>
-        <w:t xml:space="preserve">4.7.  </w:t>
-      </w:r>
-      <w:r>
-        <w:rPr>
-          <w:rFonts w:ascii="Times New Roman" w:cs="Times New Roman" w:eastAsia="Times New Roman" w:hAnsi="Times New Roman"/>
-          <w:color w:val="000000"/>
-          <w:sz w:val="22"/>
-          <w:szCs w:val="22"/>
-        </w:rPr>
-        <w:t xml:space="preserve">O enquadramento tributário da aquisição pela Companhia e da transferência ao patrimônio da usufrutuária será definido previamente com o tributarista, e seu custo integra o montante bruto.</w:t>
-      </w:r>
-    </w:p>
-    <w:p>
-      <w:pPr>
-        <w:spacing w:after="130" w:before="0" w:line="264" w:lineRule="auto"/>
-        <w:jc w:val="both"/>
-      </w:pPr>
-      <w:r>
-        <w:rPr>
-          <w:rFonts w:ascii="Times New Roman" w:cs="Times New Roman" w:eastAsia="Times New Roman" w:hAnsi="Times New Roman"/>
-          <w:b/>
-          <w:bCs/>
-          <w:color w:val="000000"/>
-          <w:sz w:val="22"/>
-          <w:szCs w:val="22"/>
-        </w:rPr>
-        <w:t xml:space="preserve">4.8.  </w:t>
-      </w:r>
-      <w:r>
-        <w:rPr>
-          <w:rFonts w:ascii="Times New Roman" w:cs="Times New Roman" w:eastAsia="Times New Roman" w:hAnsi="Times New Roman"/>
-          <w:color w:val="000000"/>
-          <w:sz w:val="22"/>
-          <w:szCs w:val="22"/>
-        </w:rPr>
-        <w:t xml:space="preserve">Aplicação da fórmula a imóvel mobiliado de R$ 1.600.000,00, a título ilustrativo:</w:t>
+        <w:spacing w:after="118" w:before="0" w:line="252" w:lineRule="auto"/>
+        <w:jc w:val="both"/>
+      </w:pPr>
+      <w:r>
+        <w:rPr>
+          <w:rFonts w:ascii="Times New Roman" w:cs="Times New Roman" w:eastAsia="Times New Roman" w:hAnsi="Times New Roman"/>
+          <w:b/>
+          <w:bCs/>
+          <w:color w:val="000000"/>
+          <w:sz w:val="22"/>
+          <w:szCs w:val="22"/>
+        </w:rPr>
+        <w:t xml:space="preserve">4.9.  </w:t>
+      </w:r>
+      <w:r>
+        <w:rPr>
+          <w:rFonts w:ascii="Times New Roman" w:cs="Times New Roman" w:eastAsia="Times New Roman" w:hAnsi="Times New Roman"/>
+          <w:color w:val="000000"/>
+          <w:sz w:val="22"/>
+          <w:szCs w:val="22"/>
+        </w:rPr>
+        <w:t xml:space="preserve">O enquadramento tributário da aquisição e da transferência ao patrimônio da usufrutuária será definido previamente com o tributarista, e seu custo integra o montante bruto.</w:t>
+      </w:r>
+    </w:p>
+    <w:p>
+      <w:pPr>
+        <w:spacing w:after="130" w:before="0" w:line="252" w:lineRule="auto"/>
+        <w:jc w:val="both"/>
+      </w:pPr>
+      <w:r>
+        <w:rPr>
+          <w:rFonts w:ascii="Times New Roman" w:cs="Times New Roman" w:eastAsia="Times New Roman" w:hAnsi="Times New Roman"/>
+          <w:b/>
+          <w:bCs/>
+          <w:color w:val="000000"/>
+          <w:sz w:val="22"/>
+          <w:szCs w:val="22"/>
+        </w:rPr>
+        <w:t xml:space="preserve">4.10.  </w:t>
+      </w:r>
+      <w:r>
+        <w:rPr>
+          <w:rFonts w:ascii="Times New Roman" w:cs="Times New Roman" w:eastAsia="Times New Roman" w:hAnsi="Times New Roman"/>
+          <w:color w:val="000000"/>
+          <w:sz w:val="22"/>
+          <w:szCs w:val="22"/>
+        </w:rPr>
+        <w:t xml:space="preserve">Aplicação da fórmula a imóvel mobiliado de R$ 1.400.000,00, a título ilustrativo:</w:t>
       </w:r>
     </w:p>
     <w:tbl>
@@ -1077,7 +1192,7 @@
                 <w:sz w:val="21"/>
                 <w:szCs w:val="21"/>
               </w:rPr>
-              <w:t xml:space="preserve">37,31% — em bem</w:t>
+              <w:t xml:space="preserve">37,3125% — em bem</w:t>
             </w:r>
           </w:p>
         </w:tc>
@@ -1103,7 +1218,7 @@
                 <w:sz w:val="21"/>
                 <w:szCs w:val="21"/>
               </w:rPr>
-              <w:t xml:space="preserve">800.000,00</w:t>
+              <w:t xml:space="preserve">700.000,000</w:t>
             </w:r>
           </w:p>
         </w:tc>
@@ -1161,7 +1276,7 @@
                 <w:sz w:val="21"/>
                 <w:szCs w:val="21"/>
               </w:rPr>
-              <w:t xml:space="preserve">37,31% — em bem</w:t>
+              <w:t xml:space="preserve">37,3125% — em bem</w:t>
             </w:r>
           </w:p>
         </w:tc>
@@ -1187,7 +1302,7 @@
                 <w:sz w:val="21"/>
                 <w:szCs w:val="21"/>
               </w:rPr>
-              <w:t xml:space="preserve">800.000,00</w:t>
+              <w:t xml:space="preserve">700.000,000</w:t>
             </w:r>
           </w:p>
         </w:tc>
@@ -1245,7 +1360,7 @@
                 <w:sz w:val="21"/>
                 <w:szCs w:val="21"/>
               </w:rPr>
-              <w:t xml:space="preserve">12,44% — em dinheiro</w:t>
+              <w:t xml:space="preserve">12,4375% — em dinheiro</w:t>
             </w:r>
           </w:p>
         </w:tc>
@@ -1271,7 +1386,7 @@
                 <w:sz w:val="21"/>
                 <w:szCs w:val="21"/>
               </w:rPr>
-              <w:t xml:space="preserve">266.738,14</w:t>
+              <w:t xml:space="preserve">233.333,333</w:t>
             </w:r>
           </w:p>
         </w:tc>
@@ -1329,7 +1444,7 @@
                 <w:sz w:val="21"/>
                 <w:szCs w:val="21"/>
               </w:rPr>
-              <w:t xml:space="preserve">12,44% — em dinheiro</w:t>
+              <w:t xml:space="preserve">12,4375% — em dinheiro</w:t>
             </w:r>
           </w:p>
         </w:tc>
@@ -1355,7 +1470,7 @@
                 <w:sz w:val="21"/>
                 <w:szCs w:val="21"/>
               </w:rPr>
-              <w:t xml:space="preserve">266.738,14</w:t>
+              <w:t xml:space="preserve">233.333,333</w:t>
             </w:r>
           </w:p>
         </w:tc>
@@ -1413,7 +1528,7 @@
                 <w:sz w:val="21"/>
                 <w:szCs w:val="21"/>
               </w:rPr>
-              <w:t xml:space="preserve">0,5% — em dinheiro</w:t>
+              <w:t xml:space="preserve">0,500% — em dinheiro</w:t>
             </w:r>
           </w:p>
         </w:tc>
@@ -1439,7 +1554,7 @@
                 <w:sz w:val="21"/>
                 <w:szCs w:val="21"/>
               </w:rPr>
-              <w:t xml:space="preserve">10.720,99</w:t>
+              <w:t xml:space="preserve">9.380,235</w:t>
             </w:r>
           </w:p>
         </w:tc>
@@ -1501,7 +1616,7 @@
                 <w:sz w:val="21"/>
                 <w:szCs w:val="21"/>
               </w:rPr>
-              <w:t xml:space="preserve">100%</w:t>
+              <w:t xml:space="preserve">100,000%</w:t>
             </w:r>
           </w:p>
         </w:tc>
@@ -1529,7 +1644,7 @@
                 <w:sz w:val="21"/>
                 <w:szCs w:val="21"/>
               </w:rPr>
-              <w:t xml:space="preserve">2.144.197,27</w:t>
+              <w:t xml:space="preserve">1.876.046,901</w:t>
             </w:r>
           </w:p>
         </w:tc>
@@ -1538,7 +1653,7 @@
     <w:p>
       <w:pPr>
         <w:keepNext/>
-        <w:spacing w:after="130" w:before="225" w:line="264" w:lineRule="auto"/>
+        <w:spacing w:after="118" w:before="205" w:line="252" w:lineRule="auto"/>
       </w:pPr>
       <w:r>
         <w:rPr>
@@ -1554,7 +1669,7 @@
     </w:p>
     <w:p>
       <w:pPr>
-        <w:spacing w:after="130" w:before="0" w:line="264" w:lineRule="auto"/>
+        <w:spacing w:after="118" w:before="0" w:line="252" w:lineRule="auto"/>
         <w:jc w:val="both"/>
       </w:pPr>
       <w:r>
@@ -1580,7 +1695,7 @@
     </w:p>
     <w:p>
       <w:pPr>
-        <w:spacing w:after="130" w:before="0" w:line="264" w:lineRule="auto"/>
+        <w:spacing w:after="118" w:before="0" w:line="252" w:lineRule="auto"/>
         <w:jc w:val="both"/>
       </w:pPr>
       <w:r>
@@ -1606,7 +1721,7 @@
     </w:p>
     <w:p>
       <w:pPr>
-        <w:spacing w:after="130" w:before="0" w:line="264" w:lineRule="auto"/>
+        <w:spacing w:after="118" w:before="0" w:line="252" w:lineRule="auto"/>
         <w:jc w:val="both"/>
       </w:pPr>
       <w:r>
@@ -1627,13 +1742,13 @@
           <w:sz w:val="22"/>
           <w:szCs w:val="22"/>
         </w:rPr>
-        <w:t xml:space="preserve">Os lucros que caberiam aos Sócios Sujeitos à Retenção são destinados a reserva fundamentada em orçamento de capital aprovado anualmente em Assembleia (art. 196 da Lei 6.404/76), obrigando-se eles a votar favoravelmente a essa destinação. O Estatuto fixará o dividendo obrigatório em percentual compatível com este Anexo (art. 202).</w:t>
+        <w:t xml:space="preserve">Os lucros que lhes caberiam são destinados a reserva fundamentada em orçamento de capital aprovado anualmente em Assembleia (art. 196 da Lei 6.404/76), obrigando-se eles a votar favoravelmente a essa destinação. O Estatuto fixará o dividendo obrigatório em percentual compatível com este Anexo (art. 202).</w:t>
       </w:r>
     </w:p>
     <w:p>
       <w:pPr>
         <w:keepNext/>
-        <w:spacing w:after="130" w:before="225" w:line="264" w:lineRule="auto"/>
+        <w:spacing w:after="118" w:before="205" w:line="252" w:lineRule="auto"/>
       </w:pPr>
       <w:r>
         <w:rPr>
@@ -1649,7 +1764,7 @@
     </w:p>
     <w:p>
       <w:pPr>
-        <w:spacing w:after="130" w:before="0" w:line="264" w:lineRule="auto"/>
+        <w:spacing w:after="118" w:before="0" w:line="252" w:lineRule="auto"/>
         <w:jc w:val="both"/>
       </w:pPr>
       <w:r>
@@ -1670,12 +1785,12 @@
           <w:sz w:val="22"/>
           <w:szCs w:val="22"/>
         </w:rPr>
-        <w:t xml:space="preserve">Não configuram distribuição vedada: (a) as parcelas do ITCMD da doação das participações e os custos dos atos societários e registrais correlatos; (b) o pró-labore, em valor de mercado aprovado em Assembleia, dos sócios que exerçam função na Companhia ou em suas controladas; (c) o reembolso de despesas comprovadas no interesse da Companhia; (d) a devolução de mútuo formalizado com juros de mercado e encargos recolhidos.</w:t>
-      </w:r>
-    </w:p>
-    <w:p>
-      <w:pPr>
-        <w:spacing w:after="130" w:before="0" w:line="264" w:lineRule="auto"/>
+        <w:t xml:space="preserve">Não configuram distribuição vedada: (a) as parcelas do ITCMD da doação e os custos dos atos societários e registrais correlatos; (b) o pró-labore, em valor de mercado aprovado em Assembleia, dos sócios que exerçam função na Companhia ou em controladas; (c) o reembolso de despesas comprovadas no interesse da Companhia; (d) a devolução de mútuo formalizado com juros de mercado e encargos recolhidos.</w:t>
+      </w:r>
+    </w:p>
+    <w:p>
+      <w:pPr>
+        <w:spacing w:after="118" w:before="0" w:line="252" w:lineRule="auto"/>
         <w:jc w:val="both"/>
       </w:pPr>
       <w:r>
@@ -1701,7 +1816,7 @@
     </w:p>
     <w:p>
       <w:pPr>
-        <w:spacing w:after="130" w:before="0" w:line="264" w:lineRule="auto"/>
+        <w:spacing w:after="118" w:before="0" w:line="252" w:lineRule="auto"/>
         <w:jc w:val="both"/>
       </w:pPr>
       <w:r>
@@ -1728,7 +1843,7 @@
     <w:p>
       <w:pPr>
         <w:keepNext/>
-        <w:spacing w:after="130" w:before="225" w:line="264" w:lineRule="auto"/>
+        <w:spacing w:after="118" w:before="205" w:line="252" w:lineRule="auto"/>
       </w:pPr>
       <w:r>
         <w:rPr>
@@ -1744,7 +1859,7 @@
     </w:p>
     <w:p>
       <w:pPr>
-        <w:spacing w:after="130" w:before="0" w:line="264" w:lineRule="auto"/>
+        <w:spacing w:after="118" w:before="0" w:line="252" w:lineRule="auto"/>
         <w:jc w:val="both"/>
       </w:pPr>
       <w:r>
@@ -1765,12 +1880,12 @@
           <w:sz w:val="22"/>
           <w:szCs w:val="22"/>
         </w:rPr>
-        <w:t xml:space="preserve">A administração apresentará relatório semestral de progresso. Entendendo as Metas cumpridas, convocará Assembleia instruída com balancete de até 30 dias, declaração do contador, comprovação da extinção de cada obrigação e as certidões e consultas do item 3.2.</w:t>
-      </w:r>
-    </w:p>
-    <w:p>
-      <w:pPr>
-        <w:spacing w:after="130" w:before="0" w:line="264" w:lineRule="auto"/>
+        <w:t xml:space="preserve">A administração apresentará relatório semestral de progresso. Entendendo as Metas cumpridas, convocará Assembleia instruída com balancete de até 30 dias, declaração do contador, comprovação da extinção de cada obrigação e as certidões do item 3.2.</w:t>
+      </w:r>
+    </w:p>
+    <w:p>
+      <w:pPr>
+        <w:spacing w:after="118" w:before="0" w:line="252" w:lineRule="auto"/>
         <w:jc w:val="both"/>
       </w:pPr>
       <w:r>
@@ -1796,7 +1911,7 @@
     </w:p>
     <w:p>
       <w:pPr>
-        <w:spacing w:after="130" w:before="0" w:line="264" w:lineRule="auto"/>
+        <w:spacing w:after="118" w:before="0" w:line="252" w:lineRule="auto"/>
         <w:jc w:val="both"/>
       </w:pPr>
       <w:r>
@@ -1822,7 +1937,7 @@
     </w:p>
     <w:p>
       <w:pPr>
-        <w:spacing w:after="130" w:before="0" w:line="264" w:lineRule="auto"/>
+        <w:spacing w:after="118" w:before="0" w:line="252" w:lineRule="auto"/>
         <w:jc w:val="both"/>
       </w:pPr>
       <w:r>
@@ -1849,7 +1964,7 @@
     <w:p>
       <w:pPr>
         <w:keepNext/>
-        <w:spacing w:after="130" w:before="225" w:line="264" w:lineRule="auto"/>
+        <w:spacing w:after="118" w:before="205" w:line="252" w:lineRule="auto"/>
       </w:pPr>
       <w:r>
         <w:rPr>
@@ -1865,7 +1980,7 @@
     </w:p>
     <w:p>
       <w:pPr>
-        <w:spacing w:after="130" w:before="0" w:line="264" w:lineRule="auto"/>
+        <w:spacing w:after="118" w:before="0" w:line="252" w:lineRule="auto"/>
         <w:jc w:val="both"/>
       </w:pPr>
       <w:r>
@@ -1891,7 +2006,7 @@
     </w:p>
     <w:p>
       <w:pPr>
-        <w:spacing w:after="0" w:before="0" w:line="264" w:lineRule="auto"/>
+        <w:spacing w:after="0" w:before="0" w:line="252" w:lineRule="auto"/>
         <w:jc w:val="both"/>
       </w:pPr>
       <w:r>
@@ -1918,7 +2033,7 @@
     <w:sectPr>
       <w:footerReference w:type="default" r:id="rId7"/>
       <w:pgSz w:w="12240" w:h="15840" w:orient="portrait"/>
-      <w:pgMar w:top="1040" w:right="1220" w:bottom="860" w:left="1220" w:header="708" w:footer="400" w:gutter="0"/>
+      <w:pgMar w:top="1000" w:right="1220" w:bottom="780" w:left="1220" w:header="708" w:footer="370" w:gutter="0"/>
       <w:pgNumType/>
       <w:docGrid w:linePitch="360"/>
     </w:sectPr>
@@ -1985,7 +2100,7 @@
         <w:sz w:val="16"/>
         <w:szCs w:val="16"/>
       </w:rPr>
-      <w:t xml:space="preserve">Minuta de trabalho, versão 3.0. Não constitui parecer jurídico; sujeita à revisão do advogado da família e de tributarista antes da assinatura.</w:t>
+      <w:t xml:space="preserve">Minuta de trabalho, versão 4.0. Não constitui parecer jurídico; sujeita à revisão do advogado da família e de tributarista antes da assinatura.</w:t>
     </w:r>
   </w:p>
 </w:ftr>

</xml_diff>